<commit_message>
Argos 3.1.3-beta: report templates follow the Report Writing structure
- Full report: numbered sections, version and handling in the header, key
  judgements (likelihood or confidence, with what they rest on) separate
  from findings (facts with source references and 4 x 4 grades, no
  confidence column), gaps and next steps, recommendations only if
  requested, annexes. Executive summary and plain Markdown report aligned.
- docs/report-writing.md describes the new templates; FAQ in the standard
  layout with a table of contents; ICD 203 and UNODC linked at first
  mention in FAQ, guidelines and README; related SOsintOps projects cited.
- docs/field-notes: copy of the Intelligence Field Notes 0.1.2.
</commit_message>
<xml_diff>
--- a/templates/Argos_Report_Executive.docx
+++ b/templates/Argos_Report_Executive.docx
@@ -122,7 +122,7 @@
         <w:pStyle w:val="Heading1"/>
       </w:pPr>
       <w:r>
-        <w:t>Summary</w:t>
+        <w:t>Bottom line</w:t>
       </w:r>
     </w:p>
     <w:p>
@@ -139,7 +139,7 @@
         <w:pStyle w:val="Heading1"/>
       </w:pPr>
       <w:r>
-        <w:t>Key findings</w:t>
+        <w:t>Key judgements</w:t>
       </w:r>
     </w:p>
     <w:p>
@@ -148,7 +148,7 @@
           <w:i/>
           <w:color w:val="595959"/>
         </w:rPr>
-        <w:t>[Confidence: High = several independent, reliable sources agree; Moderate = credible but not fully corroborated; Low = single or questionable source, treat as a lead. Likelihood words (ICD 203, one row only): almost no chance, very unlikely, unlikely, roughly even chance, likely, very likely, almost certain. Never put a confidence level and a likelihood word in the same sentence.]</w:t>
+        <w:t>[Key judgements: numbered, one sentence each, each with either a likelihood word or a confidence level and the findings or sources it rests on. Confidence: High = several independent, reliable sources agree; Moderate = credible but not fully corroborated; Low = single or questionable source, treat as a lead. Likelihood words (ICD 203, one row only): almost no chance, very unlikely, unlikely, roughly even chance, likely, very likely, almost certain. Never put a confidence level and a likelihood word in the same sentence.]</w:t>
       </w:r>
     </w:p>
     <w:tbl>
@@ -158,14 +158,15 @@
         <w:tblLook w:firstColumn="1" w:firstRow="1" w:lastColumn="0" w:lastRow="0" w:noHBand="0" w:noVBand="1" w:val="04A0"/>
       </w:tblPr>
       <w:tblGrid>
-        <w:gridCol w:w="2880"/>
-        <w:gridCol w:w="2880"/>
-        <w:gridCol w:w="2880"/>
+        <w:gridCol w:w="2160"/>
+        <w:gridCol w:w="2160"/>
+        <w:gridCol w:w="2160"/>
+        <w:gridCol w:w="2160"/>
       </w:tblGrid>
       <w:tr>
         <w:tc>
           <w:tcPr>
-            <w:tcW w:type="dxa" w:w="2880"/>
+            <w:tcW w:type="dxa" w:w="2160"/>
             <w:shd w:val="clear" w:color="auto" w:fill="E7F2F1"/>
           </w:tcPr>
           <w:p>
@@ -179,7 +180,174 @@
         </w:tc>
         <w:tc>
           <w:tcPr>
-            <w:tcW w:type="dxa" w:w="2880"/>
+            <w:tcW w:type="dxa" w:w="2160"/>
+            <w:shd w:val="clear" w:color="auto" w:fill="E7F2F1"/>
+          </w:tcPr>
+          <w:p>
+            <w:r>
+              <w:rPr>
+                <w:b/>
+              </w:rPr>
+              <w:t>Judgement</w:t>
+            </w:r>
+          </w:p>
+        </w:tc>
+        <w:tc>
+          <w:tcPr>
+            <w:tcW w:type="dxa" w:w="2160"/>
+            <w:shd w:val="clear" w:color="auto" w:fill="E7F2F1"/>
+          </w:tcPr>
+          <w:p>
+            <w:r>
+              <w:rPr>
+                <w:b/>
+              </w:rPr>
+              <w:t>Likelihood or confidence</w:t>
+            </w:r>
+          </w:p>
+        </w:tc>
+        <w:tc>
+          <w:tcPr>
+            <w:tcW w:type="dxa" w:w="2160"/>
+            <w:shd w:val="clear" w:color="auto" w:fill="E7F2F1"/>
+          </w:tcPr>
+          <w:p>
+            <w:r>
+              <w:rPr>
+                <w:b/>
+              </w:rPr>
+              <w:t>Based on</w:t>
+            </w:r>
+          </w:p>
+        </w:tc>
+      </w:tr>
+      <w:tr>
+        <w:tc>
+          <w:tcPr>
+            <w:tcW w:type="dxa" w:w="2160"/>
+          </w:tcPr>
+          <w:p/>
+        </w:tc>
+        <w:tc>
+          <w:tcPr>
+            <w:tcW w:type="dxa" w:w="2160"/>
+          </w:tcPr>
+          <w:p/>
+        </w:tc>
+        <w:tc>
+          <w:tcPr>
+            <w:tcW w:type="dxa" w:w="2160"/>
+          </w:tcPr>
+          <w:p/>
+        </w:tc>
+        <w:tc>
+          <w:tcPr>
+            <w:tcW w:type="dxa" w:w="2160"/>
+          </w:tcPr>
+          <w:p/>
+        </w:tc>
+      </w:tr>
+      <w:tr>
+        <w:tc>
+          <w:tcPr>
+            <w:tcW w:type="dxa" w:w="2160"/>
+          </w:tcPr>
+          <w:p/>
+        </w:tc>
+        <w:tc>
+          <w:tcPr>
+            <w:tcW w:type="dxa" w:w="2160"/>
+          </w:tcPr>
+          <w:p/>
+        </w:tc>
+        <w:tc>
+          <w:tcPr>
+            <w:tcW w:type="dxa" w:w="2160"/>
+          </w:tcPr>
+          <w:p/>
+        </w:tc>
+        <w:tc>
+          <w:tcPr>
+            <w:tcW w:type="dxa" w:w="2160"/>
+          </w:tcPr>
+          <w:p/>
+        </w:tc>
+      </w:tr>
+      <w:tr>
+        <w:tc>
+          <w:tcPr>
+            <w:tcW w:type="dxa" w:w="2160"/>
+          </w:tcPr>
+          <w:p/>
+        </w:tc>
+        <w:tc>
+          <w:tcPr>
+            <w:tcW w:type="dxa" w:w="2160"/>
+          </w:tcPr>
+          <w:p/>
+        </w:tc>
+        <w:tc>
+          <w:tcPr>
+            <w:tcW w:type="dxa" w:w="2160"/>
+          </w:tcPr>
+          <w:p/>
+        </w:tc>
+        <w:tc>
+          <w:tcPr>
+            <w:tcW w:type="dxa" w:w="2160"/>
+          </w:tcPr>
+          <w:p/>
+        </w:tc>
+      </w:tr>
+    </w:tbl>
+    <w:p/>
+    <w:p>
+      <w:pPr>
+        <w:pStyle w:val="Heading1"/>
+      </w:pPr>
+      <w:r>
+        <w:t>Key findings</w:t>
+      </w:r>
+    </w:p>
+    <w:p>
+      <w:r>
+        <w:rPr>
+          <w:i/>
+          <w:color w:val="595959"/>
+        </w:rPr>
+        <w:t>[Findings are the facts established, stated plainly: facts take no likelihood word and no confidence level. Each carries the references of its sources (S1, S2) and their 4 x 4 grades (e.g. B2). Anything inferred is a judgement: put it under Key judgements or Analysis.]</w:t>
+      </w:r>
+    </w:p>
+    <w:tbl>
+      <w:tblPr>
+        <w:tblStyle w:val="TableGrid"/>
+        <w:tblW w:type="auto" w:w="0"/>
+        <w:tblLook w:firstColumn="1" w:firstRow="1" w:lastColumn="0" w:lastRow="0" w:noHBand="0" w:noVBand="1" w:val="04A0"/>
+      </w:tblPr>
+      <w:tblGrid>
+        <w:gridCol w:w="2160"/>
+        <w:gridCol w:w="2160"/>
+        <w:gridCol w:w="2160"/>
+        <w:gridCol w:w="2160"/>
+      </w:tblGrid>
+      <w:tr>
+        <w:tc>
+          <w:tcPr>
+            <w:tcW w:type="dxa" w:w="2160"/>
+            <w:shd w:val="clear" w:color="auto" w:fill="E7F2F1"/>
+          </w:tcPr>
+          <w:p>
+            <w:r>
+              <w:rPr>
+                <w:b/>
+              </w:rPr>
+              <w:t>#</w:t>
+            </w:r>
+          </w:p>
+        </w:tc>
+        <w:tc>
+          <w:tcPr>
+            <w:tcW w:type="dxa" w:w="2160"/>
             <w:shd w:val="clear" w:color="auto" w:fill="E7F2F1"/>
           </w:tcPr>
           <w:p>
@@ -193,7 +361,7 @@
         </w:tc>
         <w:tc>
           <w:tcPr>
-            <w:tcW w:type="dxa" w:w="2880"/>
+            <w:tcW w:type="dxa" w:w="2160"/>
             <w:shd w:val="clear" w:color="auto" w:fill="E7F2F1"/>
           </w:tcPr>
           <w:p>
@@ -201,7 +369,21 @@
               <w:rPr>
                 <w:b/>
               </w:rPr>
-              <w:t>Confidence</w:t>
+              <w:t>Sources (Ref)</w:t>
+            </w:r>
+          </w:p>
+        </w:tc>
+        <w:tc>
+          <w:tcPr>
+            <w:tcW w:type="dxa" w:w="2160"/>
+            <w:shd w:val="clear" w:color="auto" w:fill="E7F2F1"/>
+          </w:tcPr>
+          <w:p>
+            <w:r>
+              <w:rPr>
+                <w:b/>
+              </w:rPr>
+              <w:t>Grade (4 x 4)</w:t>
             </w:r>
           </w:p>
         </w:tc>
@@ -209,19 +391,25 @@
       <w:tr>
         <w:tc>
           <w:tcPr>
-            <w:tcW w:type="dxa" w:w="2880"/>
+            <w:tcW w:type="dxa" w:w="2160"/>
           </w:tcPr>
           <w:p/>
         </w:tc>
         <w:tc>
           <w:tcPr>
-            <w:tcW w:type="dxa" w:w="2880"/>
+            <w:tcW w:type="dxa" w:w="2160"/>
           </w:tcPr>
           <w:p/>
         </w:tc>
         <w:tc>
           <w:tcPr>
-            <w:tcW w:type="dxa" w:w="2880"/>
+            <w:tcW w:type="dxa" w:w="2160"/>
+          </w:tcPr>
+          <w:p/>
+        </w:tc>
+        <w:tc>
+          <w:tcPr>
+            <w:tcW w:type="dxa" w:w="2160"/>
           </w:tcPr>
           <w:p/>
         </w:tc>
@@ -229,19 +417,25 @@
       <w:tr>
         <w:tc>
           <w:tcPr>
-            <w:tcW w:type="dxa" w:w="2880"/>
+            <w:tcW w:type="dxa" w:w="2160"/>
           </w:tcPr>
           <w:p/>
         </w:tc>
         <w:tc>
           <w:tcPr>
-            <w:tcW w:type="dxa" w:w="2880"/>
+            <w:tcW w:type="dxa" w:w="2160"/>
           </w:tcPr>
           <w:p/>
         </w:tc>
         <w:tc>
           <w:tcPr>
-            <w:tcW w:type="dxa" w:w="2880"/>
+            <w:tcW w:type="dxa" w:w="2160"/>
+          </w:tcPr>
+          <w:p/>
+        </w:tc>
+        <w:tc>
+          <w:tcPr>
+            <w:tcW w:type="dxa" w:w="2160"/>
           </w:tcPr>
           <w:p/>
         </w:tc>
@@ -249,19 +443,25 @@
       <w:tr>
         <w:tc>
           <w:tcPr>
-            <w:tcW w:type="dxa" w:w="2880"/>
+            <w:tcW w:type="dxa" w:w="2160"/>
           </w:tcPr>
           <w:p/>
         </w:tc>
         <w:tc>
           <w:tcPr>
-            <w:tcW w:type="dxa" w:w="2880"/>
+            <w:tcW w:type="dxa" w:w="2160"/>
           </w:tcPr>
           <w:p/>
         </w:tc>
         <w:tc>
           <w:tcPr>
-            <w:tcW w:type="dxa" w:w="2880"/>
+            <w:tcW w:type="dxa" w:w="2160"/>
+          </w:tcPr>
+          <w:p/>
+        </w:tc>
+        <w:tc>
+          <w:tcPr>
+            <w:tcW w:type="dxa" w:w="2160"/>
           </w:tcPr>
           <w:p/>
         </w:tc>
@@ -269,19 +469,25 @@
       <w:tr>
         <w:tc>
           <w:tcPr>
-            <w:tcW w:type="dxa" w:w="2880"/>
+            <w:tcW w:type="dxa" w:w="2160"/>
           </w:tcPr>
           <w:p/>
         </w:tc>
         <w:tc>
           <w:tcPr>
-            <w:tcW w:type="dxa" w:w="2880"/>
+            <w:tcW w:type="dxa" w:w="2160"/>
           </w:tcPr>
           <w:p/>
         </w:tc>
         <w:tc>
           <w:tcPr>
-            <w:tcW w:type="dxa" w:w="2880"/>
+            <w:tcW w:type="dxa" w:w="2160"/>
+          </w:tcPr>
+          <w:p/>
+        </w:tc>
+        <w:tc>
+          <w:tcPr>
+            <w:tcW w:type="dxa" w:w="2160"/>
           </w:tcPr>
           <w:p/>
         </w:tc>
@@ -289,19 +495,25 @@
       <w:tr>
         <w:tc>
           <w:tcPr>
-            <w:tcW w:type="dxa" w:w="2880"/>
+            <w:tcW w:type="dxa" w:w="2160"/>
           </w:tcPr>
           <w:p/>
         </w:tc>
         <w:tc>
           <w:tcPr>
-            <w:tcW w:type="dxa" w:w="2880"/>
+            <w:tcW w:type="dxa" w:w="2160"/>
           </w:tcPr>
           <w:p/>
         </w:tc>
         <w:tc>
           <w:tcPr>
-            <w:tcW w:type="dxa" w:w="2880"/>
+            <w:tcW w:type="dxa" w:w="2160"/>
+          </w:tcPr>
+          <w:p/>
+        </w:tc>
+        <w:tc>
+          <w:tcPr>
+            <w:tcW w:type="dxa" w:w="2160"/>
           </w:tcPr>
           <w:p/>
         </w:tc>
@@ -313,7 +525,7 @@
         <w:pStyle w:val="Heading1"/>
       </w:pPr>
       <w:r>
-        <w:t>Recommended action</w:t>
+        <w:t>Recommended action (only if requested)</w:t>
       </w:r>
     </w:p>
     <w:p>
@@ -322,7 +534,7 @@
           <w:i/>
           <w:color w:val="595959"/>
         </w:rPr>
-        <w:t>[What the reader should do now.]</w:t>
+        <w:t>[Only if the requester asked for it: what the reader should do now. Otherwise delete this section.]</w:t>
       </w:r>
     </w:p>
     <w:p>

</xml_diff>